<commit_message>
update Cv and add website
</commit_message>
<xml_diff>
--- a/CV.docx
+++ b/CV.docx
@@ -39,7 +39,7 @@
             <w:rFonts w:ascii="Roboto" w:hAnsi="Roboto"/>
             <w:u w:val="none"/>
           </w:rPr>
-          <w:t>Email: omid77.orh@gmail.com</w:t>
+          <w:t>Email: omid.orh@gmail.com</w:t>
         </w:r>
       </w:hyperlink>
       <w:r>
@@ -587,7 +587,109 @@
         <w:rPr>
           <w:rFonts w:ascii="Roboto" w:hAnsi="Roboto"/>
         </w:rPr>
-        <w:t>Graded assignments and exams to provide tailored feedback based on course expectations and outcomes</w:t>
+        <w:t>Graded assignments and exams</w:t>
+      </w:r>
+      <w:r>
+        <w:rPr>
+          <w:rFonts w:ascii="Roboto" w:hAnsi="Roboto"/>
+        </w:rPr>
+        <w:t xml:space="preserve"> of</w:t>
+      </w:r>
+      <w:r>
+        <w:rPr>
+          <w:rFonts w:ascii="Roboto" w:hAnsi="Roboto"/>
+        </w:rPr>
+        <w:t xml:space="preserve"> </w:t>
+      </w:r>
+      <w:r>
+        <w:rPr>
+          <w:rFonts w:ascii="Roboto" w:hAnsi="Roboto"/>
+        </w:rPr>
+        <w:t>82 students</w:t>
+      </w:r>
+      <w:r>
+        <w:rPr>
+          <w:rFonts w:ascii="Roboto" w:hAnsi="Roboto"/>
+        </w:rPr>
+        <w:t xml:space="preserve"> to provide tailored feedback based on course expectations and outcomes</w:t>
+      </w:r>
+    </w:p>
+    <w:p>
+      <w:pPr>
+        <w:spacing w:line="276" w:lineRule="auto"/>
+        <w:rPr>
+          <w:rFonts w:ascii="Roboto" w:hAnsi="Roboto"/>
+          <w:sz w:val="24"/>
+          <w:szCs w:val="24"/>
+        </w:rPr>
+      </w:pPr>
+      <w:r>
+        <w:rPr>
+          <w:rFonts w:ascii="Roboto" w:hAnsi="Roboto"/>
+          <w:b/>
+          <w:bCs/>
+          <w:sz w:val="24"/>
+          <w:szCs w:val="24"/>
+        </w:rPr>
+        <w:t>Teach</w:t>
+      </w:r>
+      <w:r>
+        <w:rPr>
+          <w:rFonts w:ascii="Roboto" w:hAnsi="Roboto"/>
+          <w:b/>
+          <w:bCs/>
+          <w:sz w:val="24"/>
+          <w:szCs w:val="24"/>
+        </w:rPr>
+        <w:t xml:space="preserve">ing Assistant, </w:t>
+      </w:r>
+      <w:r>
+        <w:rPr>
+          <w:rFonts w:ascii="Roboto" w:hAnsi="Roboto"/>
+          <w:sz w:val="24"/>
+          <w:szCs w:val="24"/>
+        </w:rPr>
+        <w:t>Advance</w:t>
+      </w:r>
+      <w:r>
+        <w:rPr>
+          <w:rFonts w:ascii="Roboto" w:hAnsi="Roboto"/>
+          <w:sz w:val="24"/>
+          <w:szCs w:val="24"/>
+        </w:rPr>
+        <w:t>d</w:t>
+      </w:r>
+      <w:r>
+        <w:rPr>
+          <w:rFonts w:ascii="Roboto" w:hAnsi="Roboto"/>
+          <w:sz w:val="24"/>
+          <w:szCs w:val="24"/>
+        </w:rPr>
+        <w:t xml:space="preserve"> programming</w:t>
+      </w:r>
+      <w:r>
+        <w:rPr>
+          <w:rFonts w:ascii="Roboto" w:hAnsi="Roboto"/>
+          <w:sz w:val="24"/>
+          <w:szCs w:val="24"/>
+        </w:rPr>
+        <w:t xml:space="preserve">, </w:t>
+      </w:r>
+      <w:r>
+        <w:rPr>
+          <w:rFonts w:ascii="Roboto" w:hAnsi="Roboto"/>
+          <w:sz w:val="24"/>
+          <w:szCs w:val="24"/>
+        </w:rPr>
+        <w:t>Islamic Azad University</w:t>
+      </w:r>
+      <w:r>
+        <w:rPr>
+          <w:rFonts w:ascii="Roboto" w:hAnsi="Roboto"/>
+          <w:sz w:val="24"/>
+          <w:szCs w:val="24"/>
+        </w:rPr>
+        <w:t>, Winter 2022</w:t>
       </w:r>
     </w:p>
     <w:p>
@@ -606,89 +708,7 @@
         <w:rPr>
           <w:rFonts w:ascii="Roboto" w:hAnsi="Roboto"/>
         </w:rPr>
-        <w:t>Held course discussion</w:t>
-      </w:r>
-      <w:r>
-        <w:rPr>
-          <w:rFonts w:ascii="Roboto" w:hAnsi="Roboto"/>
-        </w:rPr>
-        <w:t xml:space="preserve"> sessions</w:t>
-      </w:r>
-      <w:r>
-        <w:rPr>
-          <w:rFonts w:ascii="Roboto" w:hAnsi="Roboto"/>
-        </w:rPr>
-        <w:t xml:space="preserve"> for up to 82 students</w:t>
-      </w:r>
-    </w:p>
-    <w:p>
-      <w:pPr>
-        <w:spacing w:line="276" w:lineRule="auto"/>
-        <w:rPr>
-          <w:rFonts w:ascii="Roboto" w:hAnsi="Roboto"/>
-          <w:sz w:val="24"/>
-          <w:szCs w:val="24"/>
-        </w:rPr>
-      </w:pPr>
-      <w:r>
-        <w:rPr>
-          <w:rFonts w:ascii="Roboto" w:hAnsi="Roboto"/>
-          <w:b/>
-          <w:bCs/>
-          <w:sz w:val="24"/>
-          <w:szCs w:val="24"/>
-        </w:rPr>
-        <w:t>Teach</w:t>
-      </w:r>
-      <w:r>
-        <w:rPr>
-          <w:rFonts w:ascii="Roboto" w:hAnsi="Roboto"/>
-          <w:b/>
-          <w:bCs/>
-          <w:sz w:val="24"/>
-          <w:szCs w:val="24"/>
-        </w:rPr>
-        <w:t xml:space="preserve">ing Assistant, </w:t>
-      </w:r>
-      <w:r>
-        <w:rPr>
-          <w:rFonts w:ascii="Roboto" w:hAnsi="Roboto"/>
-          <w:sz w:val="24"/>
-          <w:szCs w:val="24"/>
-        </w:rPr>
-        <w:t>Advance programming</w:t>
-      </w:r>
-      <w:r>
-        <w:rPr>
-          <w:rFonts w:ascii="Roboto" w:hAnsi="Roboto"/>
-          <w:sz w:val="24"/>
-          <w:szCs w:val="24"/>
-        </w:rPr>
-        <w:t xml:space="preserve">, University of Zanjan, </w:t>
-      </w:r>
-      <w:r>
-        <w:rPr>
-          <w:rFonts w:ascii="Roboto" w:hAnsi="Roboto"/>
-          <w:sz w:val="24"/>
-          <w:szCs w:val="24"/>
-        </w:rPr>
-        <w:t xml:space="preserve">Winter </w:t>
-      </w:r>
-      <w:r>
-        <w:rPr>
-          <w:rFonts w:ascii="Roboto" w:hAnsi="Roboto"/>
-          <w:sz w:val="24"/>
-          <w:szCs w:val="24"/>
-        </w:rPr>
-        <w:t>202</w:t>
-      </w:r>
-      <w:r>
-        <w:rPr>
-          <w:rFonts w:ascii="Roboto" w:hAnsi="Roboto"/>
-          <w:sz w:val="24"/>
-          <w:szCs w:val="24"/>
-        </w:rPr>
-        <w:t>2</w:t>
+        <w:t>Graded assignments and exams to provide tailored feedback based on course expectations and outcomes</w:t>
       </w:r>
     </w:p>
     <w:p>
@@ -707,53 +727,34 @@
         <w:rPr>
           <w:rFonts w:ascii="Roboto" w:hAnsi="Roboto"/>
         </w:rPr>
-        <w:t>Graded assignments and exams to provide tailored feedback based on course expectations and outcomes</w:t>
-      </w:r>
-    </w:p>
-    <w:p>
-      <w:pPr>
-        <w:pStyle w:val="ListParagraph"/>
-        <w:numPr>
-          <w:ilvl w:val="0"/>
-          <w:numId w:val="1"/>
-        </w:numPr>
+        <w:t xml:space="preserve">Held course discussion sessions for up </w:t>
+      </w:r>
+      <w:proofErr w:type="gramStart"/>
+      <w:r>
+        <w:rPr>
+          <w:rFonts w:ascii="Roboto" w:hAnsi="Roboto"/>
+        </w:rPr>
+        <w:t xml:space="preserve">to </w:t>
+      </w:r>
+      <w:r>
+        <w:rPr>
+          <w:rFonts w:ascii="Roboto" w:hAnsi="Roboto"/>
+        </w:rPr>
+        <w:t>?</w:t>
+      </w:r>
+      <w:proofErr w:type="gramEnd"/>
+      <w:r>
+        <w:rPr>
+          <w:rFonts w:ascii="Roboto" w:hAnsi="Roboto"/>
+        </w:rPr>
+        <w:t xml:space="preserve"> students</w:t>
+      </w:r>
+    </w:p>
+    <w:p>
+      <w:pPr>
         <w:spacing w:line="276" w:lineRule="auto"/>
         <w:rPr>
           <w:rFonts w:ascii="Roboto" w:hAnsi="Roboto"/>
-        </w:rPr>
-      </w:pPr>
-      <w:r>
-        <w:rPr>
-          <w:rFonts w:ascii="Roboto" w:hAnsi="Roboto"/>
-        </w:rPr>
-        <w:t xml:space="preserve">Held course discussion sessions for up </w:t>
-      </w:r>
-      <w:proofErr w:type="gramStart"/>
-      <w:r>
-        <w:rPr>
-          <w:rFonts w:ascii="Roboto" w:hAnsi="Roboto"/>
-        </w:rPr>
-        <w:t xml:space="preserve">to </w:t>
-      </w:r>
-      <w:r>
-        <w:rPr>
-          <w:rFonts w:ascii="Roboto" w:hAnsi="Roboto"/>
-        </w:rPr>
-        <w:t>?</w:t>
-      </w:r>
-      <w:proofErr w:type="gramEnd"/>
-      <w:r>
-        <w:rPr>
-          <w:rFonts w:ascii="Roboto" w:hAnsi="Roboto"/>
-        </w:rPr>
-        <w:t xml:space="preserve"> students</w:t>
-      </w:r>
-    </w:p>
-    <w:p>
-      <w:pPr>
-        <w:spacing w:line="276" w:lineRule="auto"/>
-        <w:rPr>
-          <w:rFonts w:ascii="Roboto" w:hAnsi="Roboto"/>
           <w:sz w:val="24"/>
           <w:szCs w:val="24"/>
         </w:rPr>
@@ -784,7 +785,7 @@
           <w:sz w:val="24"/>
           <w:szCs w:val="24"/>
         </w:rPr>
-        <w:t>Database</w:t>
+        <w:t>Principles of Database Design</w:t>
       </w:r>
       <w:r>
         <w:rPr>
@@ -995,8 +996,8 @@
       <w:pPr>
         <w:rPr>
           <w:rFonts w:ascii="Roboto" w:hAnsi="Roboto"/>
-          <w:sz w:val="24"/>
-          <w:szCs w:val="24"/>
+          <w:sz w:val="28"/>
+          <w:szCs w:val="28"/>
         </w:rPr>
       </w:pPr>
       <w:r>
@@ -1141,33 +1142,33 @@
           <w:sz w:val="24"/>
           <w:szCs w:val="24"/>
         </w:rPr>
-        <w:t>M</w:t>
-      </w:r>
-      <w:r>
-        <w:rPr>
-          <w:rFonts w:ascii="Roboto" w:hAnsi="Roboto"/>
-          <w:sz w:val="24"/>
-          <w:szCs w:val="24"/>
-        </w:rPr>
-        <w:t>achine</w:t>
-      </w:r>
-      <w:r>
-        <w:rPr>
-          <w:rFonts w:ascii="Roboto" w:hAnsi="Roboto"/>
-          <w:b/>
-          <w:bCs/>
-          <w:sz w:val="24"/>
-          <w:szCs w:val="24"/>
-        </w:rPr>
-        <w:t xml:space="preserve"> L</w:t>
-      </w:r>
-      <w:r>
-        <w:rPr>
-          <w:rFonts w:ascii="Roboto" w:hAnsi="Roboto"/>
-          <w:sz w:val="24"/>
-          <w:szCs w:val="24"/>
-        </w:rPr>
-        <w:t>earning</w:t>
+        <w:t>D</w:t>
+      </w:r>
+      <w:r>
+        <w:rPr>
+          <w:rFonts w:ascii="Roboto" w:hAnsi="Roboto"/>
+          <w:sz w:val="24"/>
+          <w:szCs w:val="24"/>
+        </w:rPr>
+        <w:t>ata</w:t>
+      </w:r>
+      <w:r>
+        <w:rPr>
+          <w:rFonts w:ascii="Roboto" w:hAnsi="Roboto"/>
+          <w:b/>
+          <w:bCs/>
+          <w:sz w:val="24"/>
+          <w:szCs w:val="24"/>
+        </w:rPr>
+        <w:t xml:space="preserve"> S</w:t>
+      </w:r>
+      <w:r>
+        <w:rPr>
+          <w:rFonts w:ascii="Roboto" w:hAnsi="Roboto"/>
+          <w:sz w:val="24"/>
+          <w:szCs w:val="24"/>
+        </w:rPr>
+        <w:t>cience</w:t>
       </w:r>
       <w:r>
         <w:rPr>
@@ -1214,63 +1215,17 @@
           <w:sz w:val="24"/>
           <w:szCs w:val="24"/>
         </w:rPr>
-        <w:t>ata</w:t>
-      </w:r>
-      <w:r>
-        <w:rPr>
-          <w:rFonts w:ascii="Roboto" w:hAnsi="Roboto"/>
-          <w:b/>
-          <w:bCs/>
-          <w:sz w:val="24"/>
-          <w:szCs w:val="24"/>
-        </w:rPr>
-        <w:t xml:space="preserve"> S</w:t>
-      </w:r>
-      <w:r>
-        <w:rPr>
-          <w:rFonts w:ascii="Roboto" w:hAnsi="Roboto"/>
-          <w:sz w:val="24"/>
-          <w:szCs w:val="24"/>
-        </w:rPr>
-        <w:t>cience</w:t>
-      </w:r>
-      <w:r>
-        <w:rPr>
-          <w:rFonts w:ascii="Roboto" w:hAnsi="Roboto"/>
-          <w:color w:val="4B4C4E"/>
-          <w:sz w:val="20"/>
-          <w:szCs w:val="20"/>
-        </w:rPr>
-        <w:t xml:space="preserve"> </w:t>
-      </w:r>
-      <w:r>
-        <w:rPr>
-          <w:rFonts w:ascii="Roboto" w:hAnsi="Roboto"/>
-          <w:b/>
-          <w:bCs/>
-          <w:sz w:val="28"/>
-          <w:szCs w:val="28"/>
-        </w:rPr>
-        <w:t>•</w:t>
-      </w:r>
-      <w:r>
-        <w:rPr>
-          <w:rFonts w:ascii="Roboto" w:hAnsi="Roboto"/>
-          <w:b/>
-          <w:bCs/>
-          <w:sz w:val="28"/>
-          <w:szCs w:val="28"/>
-        </w:rPr>
-        <w:t xml:space="preserve"> D</w:t>
-      </w:r>
-      <w:r>
-        <w:rPr>
-          <w:rFonts w:ascii="Roboto" w:hAnsi="Roboto"/>
-          <w:sz w:val="28"/>
-          <w:szCs w:val="28"/>
-        </w:rPr>
         <w:t>atabase</w:t>
       </w:r>
+    </w:p>
+    <w:p>
+      <w:pPr>
+        <w:rPr>
+          <w:rFonts w:ascii="Roboto" w:hAnsi="Roboto"/>
+          <w:sz w:val="24"/>
+          <w:szCs w:val="24"/>
+        </w:rPr>
+      </w:pPr>
     </w:p>
     <w:p>
       <w:pPr>
@@ -2073,6 +2028,125 @@
           <w:szCs w:val="24"/>
         </w:rPr>
         <w:t>(20)</w:t>
+      </w:r>
+      <w:r>
+        <w:rPr>
+          <w:rFonts w:ascii="Roboto" w:hAnsi="Roboto"/>
+          <w:b/>
+          <w:bCs/>
+          <w:sz w:val="28"/>
+          <w:szCs w:val="28"/>
+          <w:lang w:bidi="fa-IR"/>
+        </w:rPr>
+        <w:t xml:space="preserve"> </w:t>
+      </w:r>
+      <w:r>
+        <w:rPr>
+          <w:rFonts w:ascii="Roboto" w:hAnsi="Roboto"/>
+          <w:b/>
+          <w:bCs/>
+          <w:sz w:val="28"/>
+          <w:szCs w:val="28"/>
+        </w:rPr>
+        <w:t>•</w:t>
+      </w:r>
+      <w:r>
+        <w:rPr>
+          <w:rFonts w:ascii="Roboto" w:hAnsi="Roboto"/>
+          <w:b/>
+          <w:bCs/>
+          <w:sz w:val="28"/>
+          <w:szCs w:val="28"/>
+        </w:rPr>
+        <w:t xml:space="preserve"> </w:t>
+      </w:r>
+      <w:r>
+        <w:rPr>
+          <w:rFonts w:ascii="Roboto" w:hAnsi="Roboto"/>
+          <w:b/>
+          <w:bCs/>
+          <w:sz w:val="24"/>
+          <w:szCs w:val="24"/>
+        </w:rPr>
+        <w:t>B</w:t>
+      </w:r>
+      <w:r>
+        <w:rPr>
+          <w:rFonts w:ascii="Roboto" w:hAnsi="Roboto"/>
+          <w:sz w:val="24"/>
+          <w:szCs w:val="24"/>
+        </w:rPr>
+        <w:t xml:space="preserve">asics </w:t>
+      </w:r>
+      <w:r>
+        <w:rPr>
+          <w:rFonts w:ascii="Roboto" w:hAnsi="Roboto"/>
+          <w:b/>
+          <w:bCs/>
+          <w:sz w:val="24"/>
+          <w:szCs w:val="24"/>
+        </w:rPr>
+        <w:t>of</w:t>
+      </w:r>
+      <w:r>
+        <w:rPr>
+          <w:rFonts w:ascii="Roboto" w:hAnsi="Roboto"/>
+          <w:sz w:val="24"/>
+          <w:szCs w:val="24"/>
+        </w:rPr>
+        <w:t xml:space="preserve"> </w:t>
+      </w:r>
+      <w:r>
+        <w:rPr>
+          <w:rFonts w:ascii="Roboto" w:hAnsi="Roboto"/>
+          <w:b/>
+          <w:bCs/>
+          <w:sz w:val="24"/>
+          <w:szCs w:val="24"/>
+        </w:rPr>
+        <w:t>W</w:t>
+      </w:r>
+      <w:r>
+        <w:rPr>
+          <w:rFonts w:ascii="Roboto" w:hAnsi="Roboto"/>
+          <w:sz w:val="24"/>
+          <w:szCs w:val="24"/>
+        </w:rPr>
+        <w:t xml:space="preserve">ireless </w:t>
+      </w:r>
+      <w:r>
+        <w:rPr>
+          <w:rFonts w:ascii="Roboto" w:hAnsi="Roboto"/>
+          <w:b/>
+          <w:bCs/>
+          <w:sz w:val="24"/>
+          <w:szCs w:val="24"/>
+        </w:rPr>
+        <w:t>N</w:t>
+      </w:r>
+      <w:r>
+        <w:rPr>
+          <w:rFonts w:ascii="Roboto" w:hAnsi="Roboto"/>
+          <w:sz w:val="24"/>
+          <w:szCs w:val="24"/>
+        </w:rPr>
+        <w:t>etworks</w:t>
+      </w:r>
+      <w:r>
+        <w:rPr>
+          <w:rFonts w:ascii="Roboto" w:hAnsi="Roboto"/>
+          <w:sz w:val="24"/>
+          <w:szCs w:val="24"/>
+        </w:rPr>
+        <w:t xml:space="preserve"> (</w:t>
+      </w:r>
+      <w:r>
+        <w:rPr>
+          <w:rFonts w:ascii="Roboto" w:hAnsi="Roboto"/>
+          <w:sz w:val="24"/>
+          <w:szCs w:val="24"/>
+        </w:rPr>
+        <w:t>17)</w:t>
       </w:r>
     </w:p>
     <w:p>
@@ -2426,9 +2500,291 @@
     </w:p>
     <w:p>
       <w:pPr>
+        <w:spacing w:line="240" w:lineRule="auto"/>
+        <w:rPr>
+          <w:rFonts w:ascii="Roboto" w:hAnsi="Roboto"/>
+          <w:b/>
+          <w:bCs/>
+          <w:sz w:val="24"/>
+          <w:szCs w:val="24"/>
+        </w:rPr>
+      </w:pPr>
+      <w:r>
+        <w:rPr>
+          <w:rFonts w:ascii="Roboto" w:hAnsi="Roboto"/>
+        </w:rPr>
+        <w:t>Feb</w:t>
+      </w:r>
+      <w:r>
+        <w:rPr>
+          <w:rFonts w:ascii="Roboto" w:hAnsi="Roboto"/>
+        </w:rPr>
+        <w:t xml:space="preserve"> </w:t>
+      </w:r>
+      <w:r>
+        <w:rPr>
+          <w:rFonts w:ascii="Roboto" w:hAnsi="Roboto"/>
+        </w:rPr>
+        <w:t>2022</w:t>
+      </w:r>
+      <w:r>
+        <w:rPr>
+          <w:rFonts w:ascii="Roboto" w:hAnsi="Roboto"/>
+          <w:b/>
+          <w:bCs/>
+        </w:rPr>
+        <w:t xml:space="preserve"> </w:t>
+      </w:r>
+      <w:r>
+        <w:rPr>
+          <w:rFonts w:ascii="Roboto" w:hAnsi="Roboto"/>
+          <w:b/>
+          <w:bCs/>
+          <w:sz w:val="24"/>
+          <w:szCs w:val="24"/>
+        </w:rPr>
+        <w:tab/>
+      </w:r>
+      <w:r>
+        <w:rPr>
+          <w:rFonts w:ascii="Roboto" w:hAnsi="Roboto"/>
+          <w:b/>
+          <w:bCs/>
+          <w:sz w:val="24"/>
+          <w:szCs w:val="24"/>
+        </w:rPr>
+        <w:t xml:space="preserve">Building </w:t>
+      </w:r>
+      <w:r>
+        <w:rPr>
+          <w:rFonts w:ascii="Roboto" w:hAnsi="Roboto"/>
+          <w:b/>
+          <w:bCs/>
+          <w:sz w:val="24"/>
+          <w:szCs w:val="24"/>
+        </w:rPr>
+        <w:t>Database</w:t>
+      </w:r>
+      <w:r>
+        <w:rPr>
+          <w:rFonts w:ascii="Roboto" w:hAnsi="Roboto"/>
+          <w:b/>
+          <w:bCs/>
+          <w:sz w:val="24"/>
+          <w:szCs w:val="24"/>
+        </w:rPr>
+        <w:t xml:space="preserve"> Applications in PHP</w:t>
+      </w:r>
+      <w:r>
+        <w:rPr>
+          <w:rFonts w:ascii="Roboto" w:hAnsi="Roboto"/>
+          <w:b/>
+          <w:bCs/>
+          <w:sz w:val="24"/>
+          <w:szCs w:val="24"/>
+        </w:rPr>
+        <w:t xml:space="preserve"> </w:t>
+      </w:r>
+    </w:p>
+    <w:p>
+      <w:pPr>
         <w:tabs>
           <w:tab w:val="left" w:pos="5280"/>
         </w:tabs>
+        <w:spacing w:line="240" w:lineRule="auto"/>
+        <w:ind w:left="1440"/>
+        <w:rPr>
+          <w:rFonts w:ascii="Roboto" w:hAnsi="Roboto"/>
+          <w:sz w:val="24"/>
+          <w:szCs w:val="24"/>
+          <w:lang w:bidi="fa-IR"/>
+        </w:rPr>
+      </w:pPr>
+      <w:r>
+        <w:rPr>
+          <w:rFonts w:ascii="Roboto" w:hAnsi="Roboto"/>
+          <w:sz w:val="24"/>
+          <w:szCs w:val="24"/>
+          <w:lang w:bidi="fa-IR"/>
+        </w:rPr>
+        <w:t>Coursera, Grade</w:t>
+      </w:r>
+      <w:proofErr w:type="gramStart"/>
+      <w:r>
+        <w:rPr>
+          <w:rFonts w:ascii="Roboto" w:hAnsi="Roboto"/>
+          <w:sz w:val="24"/>
+          <w:szCs w:val="24"/>
+          <w:lang w:bidi="fa-IR"/>
+        </w:rPr>
+        <w:t xml:space="preserve">: </w:t>
+      </w:r>
+      <w:r>
+        <w:rPr>
+          <w:rFonts w:ascii="Roboto" w:hAnsi="Roboto"/>
+          <w:sz w:val="24"/>
+          <w:szCs w:val="24"/>
+          <w:lang w:bidi="fa-IR"/>
+        </w:rPr>
+        <w:t>?</w:t>
+      </w:r>
+      <w:proofErr w:type="gramEnd"/>
+      <w:r>
+        <w:rPr>
+          <w:rFonts w:ascii="Roboto" w:hAnsi="Roboto"/>
+          <w:sz w:val="24"/>
+          <w:szCs w:val="24"/>
+          <w:lang w:bidi="fa-IR"/>
+        </w:rPr>
+        <w:t xml:space="preserve"> </w:t>
+      </w:r>
+      <w:r>
+        <w:rPr>
+          <w:rFonts w:ascii="Roboto" w:hAnsi="Roboto"/>
+          <w:sz w:val="24"/>
+          <w:szCs w:val="24"/>
+          <w:lang w:bidi="fa-IR"/>
+        </w:rPr>
+        <w:t>/100</w:t>
+      </w:r>
+    </w:p>
+    <w:p>
+      <w:pPr>
+        <w:spacing w:line="240" w:lineRule="auto"/>
+        <w:rPr>
+          <w:rFonts w:ascii="Roboto" w:hAnsi="Roboto"/>
+          <w:b/>
+          <w:bCs/>
+          <w:sz w:val="24"/>
+          <w:szCs w:val="24"/>
+        </w:rPr>
+      </w:pPr>
+      <w:r>
+        <w:rPr>
+          <w:rFonts w:ascii="Roboto" w:hAnsi="Roboto"/>
+        </w:rPr>
+        <w:t>Feb</w:t>
+      </w:r>
+      <w:r>
+        <w:rPr>
+          <w:rFonts w:ascii="Roboto" w:hAnsi="Roboto"/>
+        </w:rPr>
+        <w:t xml:space="preserve"> 202</w:t>
+      </w:r>
+      <w:r>
+        <w:rPr>
+          <w:rFonts w:ascii="Roboto" w:hAnsi="Roboto"/>
+        </w:rPr>
+        <w:t>2</w:t>
+      </w:r>
+      <w:r>
+        <w:rPr>
+          <w:rFonts w:ascii="Roboto" w:hAnsi="Roboto"/>
+          <w:b/>
+          <w:bCs/>
+        </w:rPr>
+        <w:t xml:space="preserve"> </w:t>
+      </w:r>
+      <w:r>
+        <w:rPr>
+          <w:rFonts w:ascii="Roboto" w:hAnsi="Roboto"/>
+          <w:b/>
+          <w:bCs/>
+          <w:sz w:val="24"/>
+          <w:szCs w:val="24"/>
+        </w:rPr>
+        <w:tab/>
+      </w:r>
+      <w:r>
+        <w:rPr>
+          <w:rFonts w:ascii="Roboto" w:hAnsi="Roboto"/>
+          <w:b/>
+          <w:bCs/>
+          <w:sz w:val="24"/>
+          <w:szCs w:val="24"/>
+        </w:rPr>
+        <w:t>JavaScript, JQuery, and Json</w:t>
+      </w:r>
+      <w:r>
+        <w:rPr>
+          <w:rFonts w:ascii="Roboto" w:hAnsi="Roboto"/>
+          <w:b/>
+          <w:bCs/>
+          <w:sz w:val="24"/>
+          <w:szCs w:val="24"/>
+        </w:rPr>
+        <w:t xml:space="preserve"> </w:t>
+      </w:r>
+    </w:p>
+    <w:p>
+      <w:pPr>
+        <w:tabs>
+          <w:tab w:val="left" w:pos="5280"/>
+        </w:tabs>
+        <w:spacing w:line="240" w:lineRule="auto"/>
+        <w:ind w:left="1440"/>
+        <w:rPr>
+          <w:rFonts w:ascii="Roboto" w:hAnsi="Roboto"/>
+          <w:sz w:val="24"/>
+          <w:szCs w:val="24"/>
+          <w:lang w:bidi="fa-IR"/>
+        </w:rPr>
+      </w:pPr>
+      <w:r>
+        <w:rPr>
+          <w:rFonts w:ascii="Roboto" w:hAnsi="Roboto"/>
+          <w:sz w:val="24"/>
+          <w:szCs w:val="24"/>
+          <w:lang w:bidi="fa-IR"/>
+        </w:rPr>
+        <w:t>Coursera, Grade</w:t>
+      </w:r>
+      <w:proofErr w:type="gramStart"/>
+      <w:r>
+        <w:rPr>
+          <w:rFonts w:ascii="Roboto" w:hAnsi="Roboto"/>
+          <w:sz w:val="24"/>
+          <w:szCs w:val="24"/>
+          <w:lang w:bidi="fa-IR"/>
+        </w:rPr>
+        <w:t xml:space="preserve">: </w:t>
+      </w:r>
+      <w:r>
+        <w:rPr>
+          <w:rFonts w:ascii="Roboto" w:hAnsi="Roboto"/>
+          <w:sz w:val="24"/>
+          <w:szCs w:val="24"/>
+          <w:lang w:bidi="fa-IR"/>
+        </w:rPr>
+        <w:t>?</w:t>
+      </w:r>
+      <w:proofErr w:type="gramEnd"/>
+      <w:r>
+        <w:rPr>
+          <w:rFonts w:ascii="Roboto" w:hAnsi="Roboto"/>
+          <w:sz w:val="24"/>
+          <w:szCs w:val="24"/>
+          <w:lang w:bidi="fa-IR"/>
+        </w:rPr>
+        <w:t xml:space="preserve"> </w:t>
+      </w:r>
+      <w:r>
+        <w:rPr>
+          <w:rFonts w:ascii="Roboto" w:hAnsi="Roboto"/>
+          <w:sz w:val="24"/>
+          <w:szCs w:val="24"/>
+          <w:lang w:bidi="fa-IR"/>
+        </w:rPr>
+        <w:t>/100</w:t>
+      </w:r>
+    </w:p>
+    <w:p>
+      <w:pPr>
+        <w:tabs>
+          <w:tab w:val="left" w:pos="5280"/>
+        </w:tabs>
+        <w:spacing w:line="240" w:lineRule="auto"/>
+        <w:ind w:left="1440"/>
         <w:rPr>
           <w:rFonts w:ascii="Roboto" w:hAnsi="Roboto"/>
           <w:sz w:val="24"/>
@@ -2759,7 +3115,25 @@
           <w:szCs w:val="24"/>
           <w:lang w:bidi="fa-IR"/>
         </w:rPr>
-        <w:t>, Used Books Shop Application</w:t>
+        <w:t xml:space="preserve">, Used Books </w:t>
+      </w:r>
+      <w:r>
+        <w:rPr>
+          <w:rFonts w:ascii="Roboto" w:hAnsi="Roboto"/>
+          <w:sz w:val="24"/>
+          <w:szCs w:val="24"/>
+          <w:lang w:bidi="fa-IR"/>
+        </w:rPr>
+        <w:t xml:space="preserve">Online </w:t>
+      </w:r>
+      <w:r>
+        <w:rPr>
+          <w:rFonts w:ascii="Roboto" w:hAnsi="Roboto"/>
+          <w:sz w:val="24"/>
+          <w:szCs w:val="24"/>
+          <w:lang w:bidi="fa-IR"/>
+        </w:rPr>
+        <w:t>Shop Application</w:t>
       </w:r>
     </w:p>
     <w:p>
@@ -2769,7 +3143,7 @@
         </w:tabs>
         <w:spacing w:line="240" w:lineRule="auto"/>
         <w:rPr>
-          <w:rFonts w:ascii="Roboto" w:hAnsi="Roboto" w:hint="cs"/>
+          <w:rFonts w:ascii="Roboto" w:hAnsi="Roboto"/>
           <w:sz w:val="24"/>
           <w:szCs w:val="24"/>
           <w:rtl/>
@@ -2846,7 +3220,25 @@
           <w:szCs w:val="24"/>
           <w:lang w:bidi="fa-IR"/>
         </w:rPr>
-        <w:t xml:space="preserve">develop </w:t>
+        <w:t>develop</w:t>
+      </w:r>
+      <w:r>
+        <w:rPr>
+          <w:rFonts w:ascii="Roboto" w:hAnsi="Roboto"/>
+          <w:sz w:val="24"/>
+          <w:szCs w:val="24"/>
+          <w:lang w:bidi="fa-IR"/>
+        </w:rPr>
+        <w:t>ing</w:t>
+      </w:r>
+      <w:r>
+        <w:rPr>
+          <w:rFonts w:ascii="Roboto" w:hAnsi="Roboto"/>
+          <w:sz w:val="24"/>
+          <w:szCs w:val="24"/>
+          <w:lang w:bidi="fa-IR"/>
+        </w:rPr>
+        <w:t xml:space="preserve"> </w:t>
       </w:r>
       <w:r>
         <w:rPr>
@@ -3418,6 +3810,7 @@
           <w:szCs w:val="24"/>
           <w:lang w:bidi="fa-IR"/>
         </w:rPr>
+        <w:lastRenderedPageBreak/>
         <w:t>Persian</w:t>
       </w:r>
       <w:r>
@@ -3685,7 +4078,6 @@
           <w:sz w:val="18"/>
           <w:szCs w:val="18"/>
         </w:rPr>
-        <w:lastRenderedPageBreak/>
         <mc:AlternateContent>
           <mc:Choice Requires="wps">
             <w:drawing>

</xml_diff>